<commit_message>
feat: give every activity a printable student sheet (instructions + template)
- A per-activity student sheet for all 11 remaining AIL activities (the action
  plan already had one): brief instructions, a worked example where it helps, and
  a blank fill-in template, Amala-branded and print-ready.
- Each sheet carries a "How to hand this out" note: print one per learner, or if
  you cannot print enough, show one copy on a screen / hold up the sheet and
  learners use their own notebooks.
- Each sheet is wired into its material's downloads, so it shows as a "Resource
  for this activity" in the unit block and on the material page. Added the same
  handout guidance to the unit downloads panel.

Co-Authored-By: Claude Opus 4.8 <noreply@anthropic.com>
</commit_message>
<xml_diff>
--- a/public/downloads/agency-in-learning-action-plan.docx
+++ b/public/downloads/agency-in-learning-action-plan.docx
@@ -918,6 +918,35 @@
         <w:t xml:space="preserve">I will do it on:  ________________</w:t>
       </w:r>
     </w:p>
+    <w:p>
+      <w:pPr>
+        <w:pBdr>
+          <w:top w:val="single" w:color="E7E3DA" w:sz="6" w:space="10"/>
+        </w:pBdr>
+        <w:spacing w:after="40" w:before="240"/>
+      </w:pPr>
+      <w:r>
+        <w:rPr>
+          <w:b/>
+          <w:bCs/>
+          <w:color w:val="004976"/>
+          <w:spacing w:val="20"/>
+          <w:sz w:val="17"/>
+          <w:szCs w:val="17"/>
+        </w:rPr>
+        <w:t xml:space="preserve">How to hand this out</w:t>
+      </w:r>
+    </w:p>
+    <w:p>
+      <w:r>
+        <w:rPr>
+          <w:color w:val="6B7280"/>
+          <w:sz w:val="18"/>
+          <w:szCs w:val="18"/>
+        </w:rPr>
+        <w:t xml:space="preserve">Print one for each learner. If you cannot print enough, show one copy on a screen, or hold up this sheet, and learners copy it into their own notebook.</w:t>
+      </w:r>
+    </w:p>
     <w:sectPr>
       <w:pgSz w:w="11906" w:h="16838" w:orient="portrait"/>
       <w:pgMar w:top="900" w:right="1000" w:bottom="900" w:left="1000" w:header="708" w:footer="708" w:gutter="0"/>

</xml_diff>